<commit_message>
Worked on manuscript + code
Tackled some of the last comments from reviewers in the manuscript. Also made some changes to the code to adapt figures after comment from reviewer.
</commit_message>
<xml_diff>
--- a/MSc_Project/Publications/AOS_Ornithology/CH1_Before_final_revisions_05-10-2026.docx
+++ b/MSc_Project/Publications/AOS_Ornithology/CH1_Before_final_revisions_05-10-2026.docx
@@ -11228,7 +11228,234 @@
           <w:rFonts w:eastAsiaTheme="minorEastAsia"/>
           <w:color w:val="000000" w:themeColor="text1"/>
         </w:rPr>
-        <w:t xml:space="preserve">After transformation, the data met assumptions of normality and variances were homogeneous. There was no significant difference in core home range size among sites, although the effect approached significance (ANOVA: </w:t>
+        <w:t>After transformation, the data met assumptions of normality</w:t>
+      </w:r>
+      <w:r>
+        <w:rPr>
+          <w:rFonts w:eastAsiaTheme="minorEastAsia"/>
+          <w:color w:val="000000" w:themeColor="text1"/>
+        </w:rPr>
+        <w:t xml:space="preserve"> (Shapiro-Wilk test: </w:t>
+      </w:r>
+      <w:r>
+        <w:rPr>
+          <w:rFonts w:eastAsiaTheme="minorEastAsia"/>
+          <w:color w:val="000000" w:themeColor="text1"/>
+        </w:rPr>
+        <w:t>50% KDE</w:t>
+      </w:r>
+      <w:r>
+        <w:rPr>
+          <w:rFonts w:eastAsiaTheme="minorEastAsia"/>
+          <w:color w:val="000000" w:themeColor="text1"/>
+        </w:rPr>
+        <w:t xml:space="preserve">, </w:t>
+      </w:r>
+      <w:r>
+        <w:rPr>
+          <w:rFonts w:eastAsiaTheme="minorEastAsia"/>
+          <w:i/>
+          <w:iCs/>
+          <w:color w:val="000000" w:themeColor="text1"/>
+        </w:rPr>
+        <w:t>W</w:t>
+      </w:r>
+      <w:r>
+        <w:rPr>
+          <w:rFonts w:eastAsiaTheme="minorEastAsia"/>
+          <w:color w:val="000000" w:themeColor="text1"/>
+        </w:rPr>
+        <w:t xml:space="preserve"> = 0.15</w:t>
+      </w:r>
+      <w:r>
+        <w:rPr>
+          <w:rFonts w:eastAsiaTheme="minorEastAsia"/>
+          <w:color w:val="000000" w:themeColor="text1"/>
+        </w:rPr>
+        <w:t xml:space="preserve">9, </w:t>
+      </w:r>
+      <w:r>
+        <w:rPr>
+          <w:rFonts w:eastAsiaTheme="minorEastAsia"/>
+          <w:i/>
+          <w:iCs/>
+          <w:color w:val="000000" w:themeColor="text1"/>
+        </w:rPr>
+        <w:t>p</w:t>
+      </w:r>
+      <w:r>
+        <w:rPr>
+          <w:rFonts w:eastAsiaTheme="minorEastAsia"/>
+          <w:color w:val="000000" w:themeColor="text1"/>
+        </w:rPr>
+        <w:t xml:space="preserve"> &gt; 0.05; 95% KDE, </w:t>
+      </w:r>
+      <w:r>
+        <w:rPr>
+          <w:rFonts w:eastAsiaTheme="minorEastAsia"/>
+          <w:i/>
+          <w:iCs/>
+          <w:color w:val="000000" w:themeColor="text1"/>
+        </w:rPr>
+        <w:t>W</w:t>
+      </w:r>
+      <w:r>
+        <w:rPr>
+          <w:rFonts w:eastAsiaTheme="minorEastAsia"/>
+          <w:color w:val="000000" w:themeColor="text1"/>
+        </w:rPr>
+        <w:t xml:space="preserve"> = 0.150, </w:t>
+      </w:r>
+      <w:r>
+        <w:rPr>
+          <w:rFonts w:eastAsiaTheme="minorEastAsia"/>
+          <w:i/>
+          <w:iCs/>
+          <w:color w:val="000000" w:themeColor="text1"/>
+        </w:rPr>
+        <w:t>p</w:t>
+      </w:r>
+      <w:r>
+        <w:rPr>
+          <w:rFonts w:eastAsiaTheme="minorEastAsia"/>
+          <w:color w:val="000000" w:themeColor="text1"/>
+        </w:rPr>
+        <w:t xml:space="preserve"> &gt; 0.05)</w:t>
+      </w:r>
+      <w:r>
+        <w:rPr>
+          <w:rFonts w:eastAsiaTheme="minorEastAsia"/>
+          <w:color w:val="000000" w:themeColor="text1"/>
+        </w:rPr>
+        <w:t xml:space="preserve"> and variances were homogeneous</w:t>
+      </w:r>
+      <w:r>
+        <w:rPr>
+          <w:rFonts w:eastAsiaTheme="minorEastAsia"/>
+          <w:color w:val="000000" w:themeColor="text1"/>
+        </w:rPr>
+        <w:t xml:space="preserve"> (Levene’s test: 50% KDE, </w:t>
+      </w:r>
+      <w:r>
+        <w:rPr>
+          <w:rFonts w:eastAsiaTheme="minorEastAsia"/>
+          <w:i/>
+          <w:iCs/>
+          <w:color w:val="000000" w:themeColor="text1"/>
+        </w:rPr>
+        <w:t>F</w:t>
+      </w:r>
+      <w:r>
+        <w:rPr>
+          <w:rFonts w:eastAsiaTheme="minorEastAsia"/>
+          <w:i/>
+          <w:iCs/>
+          <w:color w:val="000000" w:themeColor="text1"/>
+          <w:vertAlign w:val="subscript"/>
+        </w:rPr>
+        <w:t>2,55</w:t>
+      </w:r>
+      <w:r>
+        <w:rPr>
+          <w:rFonts w:eastAsiaTheme="minorEastAsia"/>
+          <w:i/>
+          <w:iCs/>
+          <w:color w:val="000000" w:themeColor="text1"/>
+        </w:rPr>
+        <w:t xml:space="preserve"> </w:t>
+      </w:r>
+      <w:r>
+        <w:rPr>
+          <w:rFonts w:eastAsiaTheme="minorEastAsia"/>
+          <w:color w:val="000000" w:themeColor="text1"/>
+        </w:rPr>
+        <w:t xml:space="preserve">= </w:t>
+      </w:r>
+      <w:r>
+        <w:rPr>
+          <w:rFonts w:eastAsiaTheme="minorEastAsia"/>
+          <w:color w:val="000000" w:themeColor="text1"/>
+        </w:rPr>
+        <w:t>1.07</w:t>
+      </w:r>
+      <w:r>
+        <w:rPr>
+          <w:rFonts w:eastAsiaTheme="minorEastAsia"/>
+          <w:color w:val="000000" w:themeColor="text1"/>
+        </w:rPr>
+        <w:t xml:space="preserve">, </w:t>
+      </w:r>
+      <w:r>
+        <w:rPr>
+          <w:rFonts w:eastAsiaTheme="minorEastAsia"/>
+          <w:i/>
+          <w:iCs/>
+          <w:color w:val="000000" w:themeColor="text1"/>
+        </w:rPr>
+        <w:t>p</w:t>
+      </w:r>
+      <w:r>
+        <w:rPr>
+          <w:rFonts w:eastAsiaTheme="minorEastAsia"/>
+          <w:color w:val="000000" w:themeColor="text1"/>
+        </w:rPr>
+        <w:t xml:space="preserve"> </w:t>
+      </w:r>
+      <w:r>
+        <w:rPr>
+          <w:rFonts w:eastAsiaTheme="minorEastAsia"/>
+          <w:color w:val="000000" w:themeColor="text1"/>
+        </w:rPr>
+        <w:t xml:space="preserve">= 0.350; 95% KDE, </w:t>
+      </w:r>
+      <w:r>
+        <w:rPr>
+          <w:rFonts w:eastAsiaTheme="minorEastAsia"/>
+          <w:i/>
+          <w:iCs/>
+          <w:color w:val="000000" w:themeColor="text1"/>
+        </w:rPr>
+        <w:t>F</w:t>
+      </w:r>
+      <w:r>
+        <w:rPr>
+          <w:rFonts w:eastAsiaTheme="minorEastAsia"/>
+          <w:i/>
+          <w:iCs/>
+          <w:color w:val="000000" w:themeColor="text1"/>
+          <w:vertAlign w:val="subscript"/>
+        </w:rPr>
+        <w:t>2,55</w:t>
+      </w:r>
+      <w:r>
+        <w:rPr>
+          <w:rFonts w:eastAsiaTheme="minorEastAsia"/>
+          <w:color w:val="000000" w:themeColor="text1"/>
+        </w:rPr>
+        <w:t xml:space="preserve"> = 0.61, </w:t>
+      </w:r>
+      <w:r>
+        <w:rPr>
+          <w:rFonts w:eastAsiaTheme="minorEastAsia"/>
+          <w:i/>
+          <w:iCs/>
+          <w:color w:val="000000" w:themeColor="text1"/>
+        </w:rPr>
+        <w:t>p</w:t>
+      </w:r>
+      <w:r>
+        <w:rPr>
+          <w:rFonts w:eastAsiaTheme="minorEastAsia"/>
+          <w:color w:val="000000" w:themeColor="text1"/>
+        </w:rPr>
+        <w:t xml:space="preserve"> = 0.547)</w:t>
+      </w:r>
+      <w:r>
+        <w:rPr>
+          <w:rFonts w:eastAsiaTheme="minorEastAsia"/>
+          <w:color w:val="000000" w:themeColor="text1"/>
+        </w:rPr>
+        <w:t xml:space="preserve">. There was no significant difference in core home range size among sites, although the effect approached significance (ANOVA: </w:t>
       </w:r>
       <w:r>
         <w:rPr>

</xml_diff>